<commit_message>
Record data/modelling lead roles, flag interface/writing lead as TBD
Co-Authored-By: Claude Sonnet 5 <noreply@anthropic.com>
</commit_message>
<xml_diff>
--- a/2_midterm_report/Midterm_Report_Claude_Draft.docx
+++ b/2_midterm_report/Midterm_Report_Claude_Draft.docx
@@ -707,7 +707,7 @@
                 <w:rFonts w:ascii="Times New Roman" w:hAnsi="Times New Roman"/>
                 <w:sz w:val="16"/>
               </w:rPr>
-              <w:t>Modelling lead</w:t>
+              <w:t>Modelling lead (S. Khaldoun)</w:t>
             </w:r>
           </w:p>
         </w:tc>
@@ -751,7 +751,7 @@
                 <w:rFonts w:ascii="Times New Roman" w:hAnsi="Times New Roman"/>
                 <w:sz w:val="16"/>
               </w:rPr>
-              <w:t>Interface / data lead</w:t>
+              <w:t>Interface lead (TBD); data lead (S. Khaldoun)</w:t>
             </w:r>
           </w:p>
         </w:tc>
@@ -857,12 +857,73 @@
       <w:r>
         <w:rPr>
           <w:rFonts w:ascii="Times New Roman" w:hAnsi="Times New Roman"/>
+          <w:b/>
+          <w:i w:val="0"/>
+          <w:sz w:val="20"/>
+        </w:rPr>
+        <w:t xml:space="preserve">Roles. </w:t>
+      </w:r>
+      <w:r>
+        <w:rPr>
+          <w:rFonts w:ascii="Times New Roman" w:hAnsi="Times New Roman"/>
+          <w:b w:val="0"/>
+          <w:i w:val="0"/>
+          <w:sz w:val="20"/>
+        </w:rPr>
+        <w:t xml:space="preserve">Data lead — Siham Khaldoun. Modelling lead — Siham Khaldoun. Interface lead — </w:t>
+      </w:r>
+      <w:r>
+        <w:rPr>
+          <w:rFonts w:ascii="Times New Roman" w:hAnsi="Times New Roman"/>
           <w:b w:val="0"/>
           <w:i w:val="0"/>
           <w:sz w:val="20"/>
           <w:highlight w:val="yellow"/>
         </w:rPr>
-        <w:t>Roles required by the specification (data lead, modelling lead, interface lead, writing lead) are not yet assigned by the team — this must be decided and recorded before submission.</w:t>
+        <w:t>TBD</w:t>
+      </w:r>
+      <w:r>
+        <w:rPr>
+          <w:rFonts w:ascii="Times New Roman" w:hAnsi="Times New Roman"/>
+          <w:b w:val="0"/>
+          <w:i w:val="0"/>
+          <w:sz w:val="20"/>
+        </w:rPr>
+        <w:t xml:space="preserve">. Writing lead — </w:t>
+      </w:r>
+      <w:r>
+        <w:rPr>
+          <w:rFonts w:ascii="Times New Roman" w:hAnsi="Times New Roman"/>
+          <w:b w:val="0"/>
+          <w:i w:val="0"/>
+          <w:sz w:val="20"/>
+          <w:highlight w:val="yellow"/>
+        </w:rPr>
+        <w:t>TBD</w:t>
+      </w:r>
+      <w:r>
+        <w:rPr>
+          <w:rFonts w:ascii="Times New Roman" w:hAnsi="Times New Roman"/>
+          <w:b w:val="0"/>
+          <w:i w:val="0"/>
+          <w:sz w:val="20"/>
+        </w:rPr>
+        <w:t>.</w:t>
+      </w:r>
+    </w:p>
+    <w:p>
+      <w:pPr>
+        <w:spacing w:after="160"/>
+      </w:pPr>
+      <w:r>
+        <w:rPr>
+          <w:rFonts w:ascii="Times New Roman" w:hAnsi="Times New Roman"/>
+          <w:b w:val="0"/>
+          <w:i w:val="0"/>
+          <w:sz w:val="20"/>
+          <w:highlight w:val="yellow"/>
+        </w:rPr>
+        <w:t>Interface lead and writing lead are not yet assigned — Kayla, Magalie and Larissa must decide and record this before submission.</w:t>
       </w:r>
     </w:p>
     <w:p>

</xml_diff>